<commit_message>
Adding Finance And Accounting notes
</commit_message>
<xml_diff>
--- a/Finance-And-Accounting-In-Excel/Finance-Notes-03.docx
+++ b/Finance-And-Accounting-In-Excel/Finance-Notes-03.docx
@@ -1,6 +1,6 @@
 
 <file path=word/document.xml><?xml version="1.0" encoding="utf-8"?>
-<w:document xmlns:wpc="http://schemas.microsoft.com/office/word/2010/wordprocessingCanvas" xmlns:cx="http://schemas.microsoft.com/office/drawing/2014/chartex" xmlns:cx1="http://schemas.microsoft.com/office/drawing/2015/9/8/chartex" xmlns:cx2="http://schemas.microsoft.com/office/drawing/2015/10/21/chartex" xmlns:cx3="http://schemas.microsoft.com/office/drawing/2016/5/9/chartex" xmlns:cx4="http://schemas.microsoft.com/office/drawing/2016/5/10/chartex" xmlns:cx5="http://schemas.microsoft.com/office/drawing/2016/5/11/chartex" xmlns:cx6="http://schemas.microsoft.com/office/drawing/2016/5/12/chartex" xmlns:cx7="http://schemas.microsoft.com/office/drawing/2016/5/13/chartex" xmlns:cx8="http://schemas.microsoft.com/office/drawing/2016/5/14/chartex" xmlns:mc="http://schemas.openxmlformats.org/markup-compatibility/2006" xmlns:aink="http://schemas.microsoft.com/office/drawing/2016/ink" xmlns:am3d="http://schemas.microsoft.com/office/drawing/2017/model3d" xmlns:o="urn:schemas-microsoft-com:office:office" xmlns:oel="http://schemas.microsoft.com/office/2019/extlst" xmlns:r="http://schemas.openxmlformats.org/officeDocument/2006/relationships" xmlns:m="http://schemas.openxmlformats.org/officeDocument/2006/math" xmlns:v="urn:schemas-microsoft-com:vml" xmlns:wp14="http://schemas.microsoft.com/office/word/2010/wordprocessingDrawing" xmlns:wp="http://schemas.openxmlformats.org/drawingml/2006/wordprocessingDrawing" xmlns:w10="urn:schemas-microsoft-com:office:word" xmlns:w="http://schemas.openxmlformats.org/wordprocessingml/2006/main" xmlns:w14="http://schemas.microsoft.com/office/word/2010/wordml" xmlns:w15="http://schemas.microsoft.com/office/word/2012/wordml" xmlns:w16cex="http://schemas.microsoft.com/office/word/2018/wordml/cex" xmlns:w16cid="http://schemas.microsoft.com/office/word/2016/wordml/cid" xmlns:w16="http://schemas.microsoft.com/office/word/2018/wordml" xmlns:w16du="http://schemas.microsoft.com/office/word/2023/wordml/word16du" xmlns:w16sdtdh="http://schemas.microsoft.com/office/word/2020/wordml/sdtdatahash" xmlns:w16sdtfl="http://schemas.microsoft.com/office/word/2024/wordml/sdtformatlock" xmlns:w16se="http://schemas.microsoft.com/office/word/2015/wordml/symex" xmlns:wpg="http://schemas.microsoft.com/office/word/2010/wordprocessingGroup" xmlns:wpi="http://schemas.microsoft.com/office/word/2010/wordprocessingInk" xmlns:wne="http://schemas.microsoft.com/office/word/2006/wordml" xmlns:wps="http://schemas.microsoft.com/office/word/2010/wordprocessingShape" mc:Ignorable="w14 w15 w16se w16cid w16 w16cex w16sdtdh w16sdtfl w16du wp14">
+<w:document xmlns:wpc="http://schemas.microsoft.com/office/word/2010/wordprocessingCanvas" xmlns:cx="http://schemas.microsoft.com/office/drawing/2014/chartex" xmlns:cx1="http://schemas.microsoft.com/office/drawing/2015/9/8/chartex" xmlns:cx2="http://schemas.microsoft.com/office/drawing/2015/10/21/chartex" xmlns:cx3="http://schemas.microsoft.com/office/drawing/2016/5/9/chartex" xmlns:cx4="http://schemas.microsoft.com/office/drawing/2016/5/10/chartex" xmlns:cx5="http://schemas.microsoft.com/office/drawing/2016/5/11/chartex" xmlns:cx6="http://schemas.microsoft.com/office/drawing/2016/5/12/chartex" xmlns:cx7="http://schemas.microsoft.com/office/drawing/2016/5/13/chartex" xmlns:cx8="http://schemas.microsoft.com/office/drawing/2016/5/14/chartex" xmlns:mc="http://schemas.openxmlformats.org/markup-compatibility/2006" xmlns:aink="http://schemas.microsoft.com/office/drawing/2016/ink" xmlns:am3d="http://schemas.microsoft.com/office/drawing/2017/model3d" xmlns:o="urn:schemas-microsoft-com:office:office" xmlns:oel="http://schemas.microsoft.com/office/2019/extlst" xmlns:r="http://schemas.openxmlformats.org/officeDocument/2006/relationships" xmlns:m="http://schemas.openxmlformats.org/officeDocument/2006/math" xmlns:v="urn:schemas-microsoft-com:vml" xmlns:wp14="http://schemas.microsoft.com/office/word/2010/wordprocessingDrawing" xmlns:wp="http://schemas.openxmlformats.org/drawingml/2006/wordprocessingDrawing" xmlns:w10="urn:schemas-microsoft-com:office:word" xmlns:w="http://schemas.openxmlformats.org/wordprocessingml/2006/main" xmlns:w14="http://schemas.microsoft.com/office/word/2010/wordml" xmlns:w15="http://schemas.microsoft.com/office/word/2012/wordml" xmlns:w16cei="http://schemas.microsoft.com/office/word/2026/wordml/cei" xmlns:w16cex="http://schemas.microsoft.com/office/word/2018/wordml/cex" xmlns:w16cid="http://schemas.microsoft.com/office/word/2016/wordml/cid" xmlns:w16="http://schemas.microsoft.com/office/word/2018/wordml" xmlns:w16du="http://schemas.microsoft.com/office/word/2023/wordml/word16du" xmlns:w16sdtdh="http://schemas.microsoft.com/office/word/2020/wordml/sdtdatahash" xmlns:w16sdtfl="http://schemas.microsoft.com/office/word/2024/wordml/sdtformatlock" xmlns:w16se="http://schemas.microsoft.com/office/word/2015/wordml/symex" xmlns:wpg="http://schemas.microsoft.com/office/word/2010/wordprocessingGroup" xmlns:wpi="http://schemas.microsoft.com/office/word/2010/wordprocessingInk" xmlns:wne="http://schemas.microsoft.com/office/word/2006/wordml" xmlns:wps="http://schemas.microsoft.com/office/word/2010/wordprocessingShape" mc:Ignorable="w14 w15 w16se w16cid w16 w16cex w16sdtdh w16sdtfl w16du wp14">
   <w:body>
     <w:p>
       <w:pPr>
@@ -152,13 +152,720 @@
           <w:szCs w:val="28"/>
         </w:rPr>
       </w:pPr>
-      <w:r>
-        <w:rPr>
-          <w:rFonts w:ascii="Sakkal Majalla" w:hAnsi="Sakkal Majalla" w:cs="Sakkal Majalla"/>
-          <w:sz w:val="28"/>
-          <w:szCs w:val="28"/>
-        </w:rPr>
-        <w:tab/>
+    </w:p>
+    <w:p>
+      <w:pPr>
+        <w:rPr>
+          <w:rFonts w:ascii="Sakkal Majalla" w:hAnsi="Sakkal Majalla" w:cs="Sakkal Majalla"/>
+          <w:sz w:val="28"/>
+          <w:szCs w:val="28"/>
+        </w:rPr>
+      </w:pPr>
+    </w:p>
+    <w:p>
+      <w:pPr>
+        <w:rPr>
+          <w:rFonts w:ascii="Sakkal Majalla" w:hAnsi="Sakkal Majalla" w:cs="Sakkal Majalla"/>
+          <w:sz w:val="28"/>
+          <w:szCs w:val="28"/>
+        </w:rPr>
+      </w:pPr>
+    </w:p>
+    <w:p>
+      <w:pPr>
+        <w:rPr>
+          <w:rFonts w:ascii="Sakkal Majalla" w:hAnsi="Sakkal Majalla" w:cs="Sakkal Majalla"/>
+          <w:sz w:val="28"/>
+          <w:szCs w:val="28"/>
+        </w:rPr>
+      </w:pPr>
+    </w:p>
+    <w:p>
+      <w:pPr>
+        <w:rPr>
+          <w:rFonts w:ascii="Sakkal Majalla" w:hAnsi="Sakkal Majalla" w:cs="Sakkal Majalla"/>
+          <w:sz w:val="28"/>
+          <w:szCs w:val="28"/>
+        </w:rPr>
+      </w:pPr>
+      <w:r>
+        <w:rPr>
+          <w:rFonts w:ascii="Sakkal Majalla" w:hAnsi="Sakkal Majalla" w:cs="Sakkal Majalla"/>
+          <w:sz w:val="28"/>
+          <w:szCs w:val="28"/>
+        </w:rPr>
+        <w:lastRenderedPageBreak/>
+        <w:t>To add data validation for a specific column:</w:t>
+      </w:r>
+    </w:p>
+    <w:p>
+      <w:pPr>
+        <w:rPr>
+          <w:rFonts w:ascii="Sakkal Majalla" w:hAnsi="Sakkal Majalla" w:cs="Sakkal Majalla"/>
+          <w:sz w:val="28"/>
+          <w:szCs w:val="28"/>
+        </w:rPr>
+      </w:pPr>
+      <w:r>
+        <w:rPr>
+          <w:rFonts w:ascii="Sakkal Majalla" w:hAnsi="Sakkal Majalla" w:cs="Sakkal Majalla"/>
+          <w:noProof/>
+          <w:sz w:val="28"/>
+          <w:szCs w:val="28"/>
+        </w:rPr>
+        <w:drawing>
+          <wp:inline distT="0" distB="0" distL="0" distR="0" wp14:anchorId="497725C9" wp14:editId="0F08BF7F">
+            <wp:extent cx="6644664" cy="3550920"/>
+            <wp:effectExtent l="0" t="0" r="3810" b="0"/>
+            <wp:docPr id="2065571395" name="Picture 3"/>
+            <wp:cNvGraphicFramePr>
+              <a:graphicFrameLocks xmlns:a="http://schemas.openxmlformats.org/drawingml/2006/main" noChangeAspect="1"/>
+            </wp:cNvGraphicFramePr>
+            <a:graphic xmlns:a="http://schemas.openxmlformats.org/drawingml/2006/main">
+              <a:graphicData uri="http://schemas.openxmlformats.org/drawingml/2006/picture">
+                <pic:pic xmlns:pic="http://schemas.openxmlformats.org/drawingml/2006/picture">
+                  <pic:nvPicPr>
+                    <pic:cNvPr id="2065571395" name="Picture 2065571395"/>
+                    <pic:cNvPicPr/>
+                  </pic:nvPicPr>
+                  <pic:blipFill>
+                    <a:blip r:embed="rId6">
+                      <a:extLst>
+                        <a:ext uri="{28A0092B-C50C-407E-A947-70E740481C1C}">
+                          <a14:useLocalDpi xmlns:a14="http://schemas.microsoft.com/office/drawing/2010/main" val="0"/>
+                        </a:ext>
+                      </a:extLst>
+                    </a:blip>
+                    <a:stretch>
+                      <a:fillRect/>
+                    </a:stretch>
+                  </pic:blipFill>
+                  <pic:spPr>
+                    <a:xfrm>
+                      <a:off x="0" y="0"/>
+                      <a:ext cx="6650685" cy="3554138"/>
+                    </a:xfrm>
+                    <a:prstGeom prst="rect">
+                      <a:avLst/>
+                    </a:prstGeom>
+                  </pic:spPr>
+                </pic:pic>
+              </a:graphicData>
+            </a:graphic>
+          </wp:inline>
+        </w:drawing>
+      </w:r>
+    </w:p>
+    <w:p>
+      <w:pPr>
+        <w:ind w:left="720" w:firstLine="720"/>
+        <w:rPr>
+          <w:rFonts w:ascii="Sakkal Majalla" w:hAnsi="Sakkal Majalla" w:cs="Sakkal Majalla"/>
+          <w:sz w:val="28"/>
+          <w:szCs w:val="28"/>
+        </w:rPr>
+      </w:pPr>
+      <w:r>
+        <w:rPr>
+          <w:rFonts w:ascii="Sakkal Majalla" w:hAnsi="Sakkal Majalla" w:cs="Sakkal Majalla"/>
+          <w:sz w:val="28"/>
+          <w:szCs w:val="28"/>
+        </w:rPr>
+        <w:t>--------------------------------------------------------------------------------------------------</w:t>
+      </w:r>
+    </w:p>
+    <w:p>
+      <w:pPr>
+        <w:rPr>
+          <w:rFonts w:ascii="Sakkal Majalla" w:hAnsi="Sakkal Majalla" w:cs="Sakkal Majalla"/>
+          <w:sz w:val="28"/>
+          <w:szCs w:val="28"/>
+        </w:rPr>
+      </w:pPr>
+    </w:p>
+    <w:p>
+      <w:pPr>
+        <w:rPr>
+          <w:rFonts w:ascii="Sakkal Majalla" w:hAnsi="Sakkal Majalla" w:cs="Sakkal Majalla"/>
+          <w:sz w:val="28"/>
+          <w:szCs w:val="28"/>
+        </w:rPr>
+      </w:pPr>
+      <w:r>
+        <w:rPr>
+          <w:rFonts w:ascii="Sakkal Majalla" w:hAnsi="Sakkal Majalla" w:cs="Sakkal Majalla"/>
+          <w:sz w:val="28"/>
+          <w:szCs w:val="28"/>
+        </w:rPr>
+        <w:br w:type="page"/>
+      </w:r>
+      <w:r>
+        <w:rPr>
+          <w:rFonts w:ascii="Sakkal Majalla" w:hAnsi="Sakkal Majalla" w:cs="Sakkal Majalla"/>
+          <w:noProof/>
+          <w:sz w:val="28"/>
+          <w:szCs w:val="28"/>
+        </w:rPr>
+        <w:lastRenderedPageBreak/>
+        <w:drawing>
+          <wp:inline distT="0" distB="0" distL="0" distR="0" wp14:anchorId="4D8CF4CD" wp14:editId="00DA94DA">
+            <wp:extent cx="5943600" cy="3162935"/>
+            <wp:effectExtent l="0" t="0" r="0" b="0"/>
+            <wp:docPr id="468403365" name="Picture 2"/>
+            <wp:cNvGraphicFramePr>
+              <a:graphicFrameLocks xmlns:a="http://schemas.openxmlformats.org/drawingml/2006/main" noChangeAspect="1"/>
+            </wp:cNvGraphicFramePr>
+            <a:graphic xmlns:a="http://schemas.openxmlformats.org/drawingml/2006/main">
+              <a:graphicData uri="http://schemas.openxmlformats.org/drawingml/2006/picture">
+                <pic:pic xmlns:pic="http://schemas.openxmlformats.org/drawingml/2006/picture">
+                  <pic:nvPicPr>
+                    <pic:cNvPr id="468403365" name="Picture 468403365"/>
+                    <pic:cNvPicPr/>
+                  </pic:nvPicPr>
+                  <pic:blipFill>
+                    <a:blip r:embed="rId7">
+                      <a:extLst>
+                        <a:ext uri="{28A0092B-C50C-407E-A947-70E740481C1C}">
+                          <a14:useLocalDpi xmlns:a14="http://schemas.microsoft.com/office/drawing/2010/main" val="0"/>
+                        </a:ext>
+                      </a:extLst>
+                    </a:blip>
+                    <a:stretch>
+                      <a:fillRect/>
+                    </a:stretch>
+                  </pic:blipFill>
+                  <pic:spPr>
+                    <a:xfrm>
+                      <a:off x="0" y="0"/>
+                      <a:ext cx="5943600" cy="3162935"/>
+                    </a:xfrm>
+                    <a:prstGeom prst="rect">
+                      <a:avLst/>
+                    </a:prstGeom>
+                  </pic:spPr>
+                </pic:pic>
+              </a:graphicData>
+            </a:graphic>
+          </wp:inline>
+        </w:drawing>
+      </w:r>
+    </w:p>
+    <w:p>
+      <w:pPr>
+        <w:ind w:left="720" w:firstLine="720"/>
+        <w:rPr>
+          <w:rFonts w:ascii="Sakkal Majalla" w:hAnsi="Sakkal Majalla" w:cs="Sakkal Majalla"/>
+          <w:sz w:val="28"/>
+          <w:szCs w:val="28"/>
+        </w:rPr>
+      </w:pPr>
+      <w:r>
+        <w:rPr>
+          <w:rFonts w:ascii="Sakkal Majalla" w:hAnsi="Sakkal Majalla" w:cs="Sakkal Majalla"/>
+          <w:sz w:val="28"/>
+          <w:szCs w:val="28"/>
+        </w:rPr>
+        <w:t>--------------------------------------------------------------------------------------------------</w:t>
+      </w:r>
+    </w:p>
+    <w:p>
+      <w:pPr>
+        <w:rPr>
+          <w:rFonts w:ascii="Sakkal Majalla" w:hAnsi="Sakkal Majalla" w:cs="Sakkal Majalla"/>
+          <w:sz w:val="28"/>
+          <w:szCs w:val="28"/>
+        </w:rPr>
+      </w:pPr>
+      <w:r>
+        <w:rPr>
+          <w:rFonts w:ascii="Sakkal Majalla" w:hAnsi="Sakkal Majalla" w:cs="Sakkal Majalla"/>
+          <w:noProof/>
+          <w:sz w:val="28"/>
+          <w:szCs w:val="28"/>
+        </w:rPr>
+        <w:drawing>
+          <wp:inline distT="0" distB="0" distL="0" distR="0" wp14:anchorId="55B82762" wp14:editId="46C088AA">
+            <wp:extent cx="5943600" cy="3176270"/>
+            <wp:effectExtent l="0" t="0" r="0" b="5080"/>
+            <wp:docPr id="1880936731" name="Picture 1"/>
+            <wp:cNvGraphicFramePr>
+              <a:graphicFrameLocks xmlns:a="http://schemas.openxmlformats.org/drawingml/2006/main" noChangeAspect="1"/>
+            </wp:cNvGraphicFramePr>
+            <a:graphic xmlns:a="http://schemas.openxmlformats.org/drawingml/2006/main">
+              <a:graphicData uri="http://schemas.openxmlformats.org/drawingml/2006/picture">
+                <pic:pic xmlns:pic="http://schemas.openxmlformats.org/drawingml/2006/picture">
+                  <pic:nvPicPr>
+                    <pic:cNvPr id="1880936731" name="Picture 1880936731"/>
+                    <pic:cNvPicPr/>
+                  </pic:nvPicPr>
+                  <pic:blipFill>
+                    <a:blip r:embed="rId8">
+                      <a:extLst>
+                        <a:ext uri="{28A0092B-C50C-407E-A947-70E740481C1C}">
+                          <a14:useLocalDpi xmlns:a14="http://schemas.microsoft.com/office/drawing/2010/main" val="0"/>
+                        </a:ext>
+                      </a:extLst>
+                    </a:blip>
+                    <a:stretch>
+                      <a:fillRect/>
+                    </a:stretch>
+                  </pic:blipFill>
+                  <pic:spPr>
+                    <a:xfrm>
+                      <a:off x="0" y="0"/>
+                      <a:ext cx="5943600" cy="3176270"/>
+                    </a:xfrm>
+                    <a:prstGeom prst="rect">
+                      <a:avLst/>
+                    </a:prstGeom>
+                  </pic:spPr>
+                </pic:pic>
+              </a:graphicData>
+            </a:graphic>
+          </wp:inline>
+        </w:drawing>
+      </w:r>
+    </w:p>
+    <w:p>
+      <w:pPr>
+        <w:ind w:left="720" w:firstLine="720"/>
+        <w:rPr>
+          <w:rFonts w:ascii="Sakkal Majalla" w:hAnsi="Sakkal Majalla" w:cs="Sakkal Majalla"/>
+          <w:sz w:val="28"/>
+          <w:szCs w:val="28"/>
+        </w:rPr>
+      </w:pPr>
+      <w:r>
+        <w:rPr>
+          <w:rFonts w:ascii="Sakkal Majalla" w:hAnsi="Sakkal Majalla" w:cs="Sakkal Majalla"/>
+          <w:sz w:val="28"/>
+          <w:szCs w:val="28"/>
+        </w:rPr>
+        <w:t>=======================================================</w:t>
+      </w:r>
+    </w:p>
+    <w:p>
+      <w:pPr>
+        <w:rPr>
+          <w:rFonts w:ascii="Sakkal Majalla" w:hAnsi="Sakkal Majalla" w:cs="Sakkal Majalla"/>
+          <w:sz w:val="28"/>
+          <w:szCs w:val="28"/>
+        </w:rPr>
+      </w:pPr>
+    </w:p>
+    <w:p>
+      <w:pPr>
+        <w:rPr>
+          <w:rFonts w:ascii="Sakkal Majalla" w:hAnsi="Sakkal Majalla" w:cs="Sakkal Majalla"/>
+          <w:sz w:val="28"/>
+          <w:szCs w:val="28"/>
+        </w:rPr>
+      </w:pPr>
+    </w:p>
+    <w:p>
+      <w:pPr>
+        <w:rPr>
+          <w:rFonts w:ascii="Sakkal Majalla" w:hAnsi="Sakkal Majalla" w:cs="Sakkal Majalla"/>
+          <w:sz w:val="28"/>
+          <w:szCs w:val="28"/>
+        </w:rPr>
+      </w:pPr>
+      <w:r>
+        <w:rPr>
+          <w:rFonts w:ascii="Sakkal Majalla" w:hAnsi="Sakkal Majalla" w:cs="Sakkal Majalla"/>
+          <w:sz w:val="28"/>
+          <w:szCs w:val="28"/>
+        </w:rPr>
+        <w:lastRenderedPageBreak/>
+        <w:t>To add current date (CTRL+;) and to add the current time (SHIFT+CTRL+;):</w:t>
+      </w:r>
+    </w:p>
+    <w:p>
+      <w:pPr>
+        <w:rPr>
+          <w:rFonts w:ascii="Sakkal Majalla" w:hAnsi="Sakkal Majalla" w:cs="Sakkal Majalla"/>
+          <w:sz w:val="28"/>
+          <w:szCs w:val="28"/>
+        </w:rPr>
+      </w:pPr>
+      <w:r>
+        <w:rPr>
+          <w:rFonts w:ascii="Sakkal Majalla" w:hAnsi="Sakkal Majalla" w:cs="Sakkal Majalla"/>
+          <w:noProof/>
+          <w:sz w:val="28"/>
+          <w:szCs w:val="28"/>
+        </w:rPr>
+        <w:drawing>
+          <wp:inline distT="0" distB="0" distL="0" distR="0" wp14:anchorId="48EBD356" wp14:editId="6B4BEA6D">
+            <wp:extent cx="6473557" cy="3459480"/>
+            <wp:effectExtent l="0" t="0" r="3810" b="7620"/>
+            <wp:docPr id="96981220" name="Picture 4"/>
+            <wp:cNvGraphicFramePr>
+              <a:graphicFrameLocks xmlns:a="http://schemas.openxmlformats.org/drawingml/2006/main" noChangeAspect="1"/>
+            </wp:cNvGraphicFramePr>
+            <a:graphic xmlns:a="http://schemas.openxmlformats.org/drawingml/2006/main">
+              <a:graphicData uri="http://schemas.openxmlformats.org/drawingml/2006/picture">
+                <pic:pic xmlns:pic="http://schemas.openxmlformats.org/drawingml/2006/picture">
+                  <pic:nvPicPr>
+                    <pic:cNvPr id="96981220" name="Picture 96981220"/>
+                    <pic:cNvPicPr/>
+                  </pic:nvPicPr>
+                  <pic:blipFill>
+                    <a:blip r:embed="rId9">
+                      <a:extLst>
+                        <a:ext uri="{28A0092B-C50C-407E-A947-70E740481C1C}">
+                          <a14:useLocalDpi xmlns:a14="http://schemas.microsoft.com/office/drawing/2010/main" val="0"/>
+                        </a:ext>
+                      </a:extLst>
+                    </a:blip>
+                    <a:stretch>
+                      <a:fillRect/>
+                    </a:stretch>
+                  </pic:blipFill>
+                  <pic:spPr>
+                    <a:xfrm>
+                      <a:off x="0" y="0"/>
+                      <a:ext cx="6475064" cy="3460285"/>
+                    </a:xfrm>
+                    <a:prstGeom prst="rect">
+                      <a:avLst/>
+                    </a:prstGeom>
+                  </pic:spPr>
+                </pic:pic>
+              </a:graphicData>
+            </a:graphic>
+          </wp:inline>
+        </w:drawing>
+      </w:r>
+    </w:p>
+    <w:p>
+      <w:pPr>
+        <w:ind w:left="720" w:firstLine="720"/>
+        <w:rPr>
+          <w:rFonts w:ascii="Sakkal Majalla" w:hAnsi="Sakkal Majalla" w:cs="Sakkal Majalla"/>
+          <w:sz w:val="28"/>
+          <w:szCs w:val="28"/>
+        </w:rPr>
+      </w:pPr>
+      <w:r>
+        <w:rPr>
+          <w:rFonts w:ascii="Sakkal Majalla" w:hAnsi="Sakkal Majalla" w:cs="Sakkal Majalla"/>
+          <w:sz w:val="28"/>
+          <w:szCs w:val="28"/>
+        </w:rPr>
+        <w:t>=======================================================</w:t>
+      </w:r>
+    </w:p>
+    <w:p>
+      <w:pPr>
+        <w:rPr>
+          <w:rFonts w:ascii="Sakkal Majalla" w:hAnsi="Sakkal Majalla" w:cs="Sakkal Majalla"/>
+          <w:sz w:val="28"/>
+          <w:szCs w:val="28"/>
+        </w:rPr>
+      </w:pPr>
+      <w:r>
+        <w:rPr>
+          <w:rFonts w:ascii="Sakkal Majalla" w:hAnsi="Sakkal Majalla" w:cs="Sakkal Majalla"/>
+          <w:sz w:val="28"/>
+          <w:szCs w:val="28"/>
+        </w:rPr>
+        <w:t>To clear the data validation:</w:t>
+      </w:r>
+    </w:p>
+    <w:p>
+      <w:pPr>
+        <w:rPr>
+          <w:rFonts w:ascii="Sakkal Majalla" w:hAnsi="Sakkal Majalla" w:cs="Sakkal Majalla"/>
+          <w:sz w:val="28"/>
+          <w:szCs w:val="28"/>
+        </w:rPr>
+      </w:pPr>
+      <w:r>
+        <w:rPr>
+          <w:rFonts w:ascii="Sakkal Majalla" w:hAnsi="Sakkal Majalla" w:cs="Sakkal Majalla"/>
+          <w:noProof/>
+          <w:sz w:val="28"/>
+          <w:szCs w:val="28"/>
+        </w:rPr>
+        <w:drawing>
+          <wp:inline distT="0" distB="0" distL="0" distR="0" wp14:anchorId="28C709BA" wp14:editId="292FB117">
+            <wp:extent cx="6674246" cy="3017520"/>
+            <wp:effectExtent l="0" t="0" r="0" b="0"/>
+            <wp:docPr id="772152125" name="Picture 5"/>
+            <wp:cNvGraphicFramePr>
+              <a:graphicFrameLocks xmlns:a="http://schemas.openxmlformats.org/drawingml/2006/main" noChangeAspect="1"/>
+            </wp:cNvGraphicFramePr>
+            <a:graphic xmlns:a="http://schemas.openxmlformats.org/drawingml/2006/main">
+              <a:graphicData uri="http://schemas.openxmlformats.org/drawingml/2006/picture">
+                <pic:pic xmlns:pic="http://schemas.openxmlformats.org/drawingml/2006/picture">
+                  <pic:nvPicPr>
+                    <pic:cNvPr id="772152125" name="Picture 772152125"/>
+                    <pic:cNvPicPr/>
+                  </pic:nvPicPr>
+                  <pic:blipFill>
+                    <a:blip r:embed="rId10">
+                      <a:extLst>
+                        <a:ext uri="{28A0092B-C50C-407E-A947-70E740481C1C}">
+                          <a14:useLocalDpi xmlns:a14="http://schemas.microsoft.com/office/drawing/2010/main" val="0"/>
+                        </a:ext>
+                      </a:extLst>
+                    </a:blip>
+                    <a:stretch>
+                      <a:fillRect/>
+                    </a:stretch>
+                  </pic:blipFill>
+                  <pic:spPr>
+                    <a:xfrm>
+                      <a:off x="0" y="0"/>
+                      <a:ext cx="6697618" cy="3028087"/>
+                    </a:xfrm>
+                    <a:prstGeom prst="rect">
+                      <a:avLst/>
+                    </a:prstGeom>
+                  </pic:spPr>
+                </pic:pic>
+              </a:graphicData>
+            </a:graphic>
+          </wp:inline>
+        </w:drawing>
+      </w:r>
+    </w:p>
+    <w:p>
+      <w:pPr>
+        <w:ind w:left="720" w:firstLine="720"/>
+        <w:rPr>
+          <w:rFonts w:ascii="Sakkal Majalla" w:hAnsi="Sakkal Majalla" w:cs="Sakkal Majalla"/>
+          <w:sz w:val="28"/>
+          <w:szCs w:val="28"/>
+        </w:rPr>
+      </w:pPr>
+      <w:r>
+        <w:rPr>
+          <w:rFonts w:ascii="Sakkal Majalla" w:hAnsi="Sakkal Majalla" w:cs="Sakkal Majalla"/>
+          <w:sz w:val="28"/>
+          <w:szCs w:val="28"/>
+        </w:rPr>
+        <w:t>=======================================================</w:t>
+      </w:r>
+    </w:p>
+    <w:p>
+      <w:pPr>
+        <w:rPr>
+          <w:rFonts w:ascii="Sakkal Majalla" w:hAnsi="Sakkal Majalla" w:cs="Sakkal Majalla"/>
+          <w:sz w:val="28"/>
+          <w:szCs w:val="28"/>
+        </w:rPr>
+      </w:pPr>
+      <w:r>
+        <w:rPr>
+          <w:rFonts w:ascii="Sakkal Majalla" w:hAnsi="Sakkal Majalla" w:cs="Sakkal Majalla"/>
+          <w:sz w:val="28"/>
+          <w:szCs w:val="28"/>
+        </w:rPr>
+        <w:lastRenderedPageBreak/>
+        <w:t>To select the entire column (CTRL + SHIFT + DOWN ARROW):</w:t>
+      </w:r>
+    </w:p>
+    <w:p>
+      <w:pPr>
+        <w:rPr>
+          <w:rFonts w:ascii="Sakkal Majalla" w:hAnsi="Sakkal Majalla" w:cs="Sakkal Majalla"/>
+          <w:sz w:val="28"/>
+          <w:szCs w:val="28"/>
+        </w:rPr>
+      </w:pPr>
+      <w:r>
+        <w:rPr>
+          <w:rFonts w:ascii="Sakkal Majalla" w:hAnsi="Sakkal Majalla" w:cs="Sakkal Majalla"/>
+          <w:noProof/>
+          <w:sz w:val="28"/>
+          <w:szCs w:val="28"/>
+        </w:rPr>
+        <w:drawing>
+          <wp:inline distT="0" distB="0" distL="0" distR="0" wp14:anchorId="0F237410" wp14:editId="62DE507C">
+            <wp:extent cx="6625418" cy="3535680"/>
+            <wp:effectExtent l="0" t="0" r="4445" b="7620"/>
+            <wp:docPr id="588852265" name="Picture 6"/>
+            <wp:cNvGraphicFramePr>
+              <a:graphicFrameLocks xmlns:a="http://schemas.openxmlformats.org/drawingml/2006/main" noChangeAspect="1"/>
+            </wp:cNvGraphicFramePr>
+            <a:graphic xmlns:a="http://schemas.openxmlformats.org/drawingml/2006/main">
+              <a:graphicData uri="http://schemas.openxmlformats.org/drawingml/2006/picture">
+                <pic:pic xmlns:pic="http://schemas.openxmlformats.org/drawingml/2006/picture">
+                  <pic:nvPicPr>
+                    <pic:cNvPr id="588852265" name="Picture 588852265"/>
+                    <pic:cNvPicPr/>
+                  </pic:nvPicPr>
+                  <pic:blipFill>
+                    <a:blip r:embed="rId11">
+                      <a:extLst>
+                        <a:ext uri="{28A0092B-C50C-407E-A947-70E740481C1C}">
+                          <a14:useLocalDpi xmlns:a14="http://schemas.microsoft.com/office/drawing/2010/main" val="0"/>
+                        </a:ext>
+                      </a:extLst>
+                    </a:blip>
+                    <a:stretch>
+                      <a:fillRect/>
+                    </a:stretch>
+                  </pic:blipFill>
+                  <pic:spPr>
+                    <a:xfrm>
+                      <a:off x="0" y="0"/>
+                      <a:ext cx="6632743" cy="3539589"/>
+                    </a:xfrm>
+                    <a:prstGeom prst="rect">
+                      <a:avLst/>
+                    </a:prstGeom>
+                  </pic:spPr>
+                </pic:pic>
+              </a:graphicData>
+            </a:graphic>
+          </wp:inline>
+        </w:drawing>
+      </w:r>
+    </w:p>
+    <w:p>
+      <w:pPr>
+        <w:ind w:left="720" w:firstLine="720"/>
+        <w:rPr>
+          <w:rFonts w:ascii="Sakkal Majalla" w:hAnsi="Sakkal Majalla" w:cs="Sakkal Majalla"/>
+          <w:sz w:val="28"/>
+          <w:szCs w:val="28"/>
+        </w:rPr>
+      </w:pPr>
+      <w:r>
+        <w:rPr>
+          <w:rFonts w:ascii="Sakkal Majalla" w:hAnsi="Sakkal Majalla" w:cs="Sakkal Majalla"/>
+          <w:sz w:val="28"/>
+          <w:szCs w:val="28"/>
+        </w:rPr>
+        <w:t>=======================================================</w:t>
+      </w:r>
+    </w:p>
+    <w:p>
+      <w:pPr>
+        <w:rPr>
+          <w:rFonts w:ascii="Sakkal Majalla" w:hAnsi="Sakkal Majalla" w:cs="Sakkal Majalla"/>
+          <w:sz w:val="28"/>
+          <w:szCs w:val="28"/>
+        </w:rPr>
+      </w:pPr>
+      <w:r>
+        <w:rPr>
+          <w:rFonts w:ascii="Sakkal Majalla" w:hAnsi="Sakkal Majalla" w:cs="Sakkal Majalla"/>
+          <w:sz w:val="28"/>
+          <w:szCs w:val="28"/>
+        </w:rPr>
+        <w:t>To freeze the top row</w:t>
+      </w:r>
+      <w:r>
+        <w:rPr>
+          <w:rFonts w:ascii="Sakkal Majalla" w:hAnsi="Sakkal Majalla" w:cs="Sakkal Majalla"/>
+          <w:sz w:val="28"/>
+          <w:szCs w:val="28"/>
+        </w:rPr>
+        <w:t xml:space="preserve"> from the View</w:t>
+      </w:r>
+      <w:r>
+        <w:rPr>
+          <w:rFonts w:ascii="Sakkal Majalla" w:hAnsi="Sakkal Majalla" w:cs="Sakkal Majalla"/>
+          <w:sz w:val="28"/>
+          <w:szCs w:val="28"/>
+        </w:rPr>
+        <w:t>-T</w:t>
+      </w:r>
+      <w:r>
+        <w:rPr>
+          <w:rFonts w:ascii="Sakkal Majalla" w:hAnsi="Sakkal Majalla" w:cs="Sakkal Majalla"/>
+          <w:sz w:val="28"/>
+          <w:szCs w:val="28"/>
+        </w:rPr>
+        <w:t>ab</w:t>
+      </w:r>
+      <w:r>
+        <w:rPr>
+          <w:rFonts w:ascii="Sakkal Majalla" w:hAnsi="Sakkal Majalla" w:cs="Sakkal Majalla"/>
+          <w:sz w:val="28"/>
+          <w:szCs w:val="28"/>
+        </w:rPr>
+        <w:t>:</w:t>
+      </w:r>
+    </w:p>
+    <w:p>
+      <w:pPr>
+        <w:rPr>
+          <w:rFonts w:ascii="Sakkal Majalla" w:hAnsi="Sakkal Majalla" w:cs="Sakkal Majalla"/>
+          <w:sz w:val="28"/>
+          <w:szCs w:val="28"/>
+        </w:rPr>
+      </w:pPr>
+      <w:r>
+        <w:rPr>
+          <w:rFonts w:ascii="Sakkal Majalla" w:hAnsi="Sakkal Majalla" w:cs="Sakkal Majalla"/>
+          <w:noProof/>
+          <w:sz w:val="28"/>
+          <w:szCs w:val="28"/>
+        </w:rPr>
+        <w:drawing>
+          <wp:inline distT="0" distB="0" distL="0" distR="0" wp14:anchorId="3E8640C2" wp14:editId="7FBD9506">
+            <wp:extent cx="6583680" cy="2971800"/>
+            <wp:effectExtent l="0" t="0" r="7620" b="0"/>
+            <wp:docPr id="989222460" name="Picture 7"/>
+            <wp:cNvGraphicFramePr>
+              <a:graphicFrameLocks xmlns:a="http://schemas.openxmlformats.org/drawingml/2006/main" noChangeAspect="1"/>
+            </wp:cNvGraphicFramePr>
+            <a:graphic xmlns:a="http://schemas.openxmlformats.org/drawingml/2006/main">
+              <a:graphicData uri="http://schemas.openxmlformats.org/drawingml/2006/picture">
+                <pic:pic xmlns:pic="http://schemas.openxmlformats.org/drawingml/2006/picture">
+                  <pic:nvPicPr>
+                    <pic:cNvPr id="989222460" name="Picture 989222460"/>
+                    <pic:cNvPicPr/>
+                  </pic:nvPicPr>
+                  <pic:blipFill>
+                    <a:blip r:embed="rId12" cstate="print">
+                      <a:extLst>
+                        <a:ext uri="{28A0092B-C50C-407E-A947-70E740481C1C}">
+                          <a14:useLocalDpi xmlns:a14="http://schemas.microsoft.com/office/drawing/2010/main" val="0"/>
+                        </a:ext>
+                      </a:extLst>
+                    </a:blip>
+                    <a:stretch>
+                      <a:fillRect/>
+                    </a:stretch>
+                  </pic:blipFill>
+                  <pic:spPr>
+                    <a:xfrm>
+                      <a:off x="0" y="0"/>
+                      <a:ext cx="6595785" cy="2977264"/>
+                    </a:xfrm>
+                    <a:prstGeom prst="rect">
+                      <a:avLst/>
+                    </a:prstGeom>
+                  </pic:spPr>
+                </pic:pic>
+              </a:graphicData>
+            </a:graphic>
+          </wp:inline>
+        </w:drawing>
+      </w:r>
+    </w:p>
+    <w:p>
+      <w:pPr>
+        <w:ind w:left="720" w:firstLine="720"/>
+        <w:rPr>
+          <w:rFonts w:ascii="Sakkal Majalla" w:hAnsi="Sakkal Majalla" w:cs="Sakkal Majalla"/>
+          <w:sz w:val="28"/>
+          <w:szCs w:val="28"/>
+        </w:rPr>
+      </w:pPr>
+      <w:r>
+        <w:rPr>
+          <w:rFonts w:ascii="Sakkal Majalla" w:hAnsi="Sakkal Majalla" w:cs="Sakkal Majalla"/>
+          <w:sz w:val="28"/>
+          <w:szCs w:val="28"/>
+        </w:rPr>
+        <w:t>=======================================================</w:t>
       </w:r>
     </w:p>
     <w:sectPr>

</xml_diff>